<commit_message>
Ship Ver 1.2.2: bilingual polish, EN-side resolve, and sample-field splits.
Harden English placeholder/cover handling, align field labels with the application, and tighten detail/export UI for the three-way report path.

Co-authored-by: Cursor <cursoragent@cursor.com>
</commit_message>
<xml_diff>
--- a/templates/template_zh.docx
+++ b/templates/template_zh.docx
@@ -2,13 +2,7 @@
 <file path=word/document.xml><?xml version="1.0" encoding="utf-8"?>
 <w:document xmlns:wpc="http://schemas.microsoft.com/office/word/2010/wordprocessingCanvas" xmlns:cx="http://schemas.microsoft.com/office/drawing/2014/chartex" xmlns:cx1="http://schemas.microsoft.com/office/drawing/2015/9/8/chartex" xmlns:cx2="http://schemas.microsoft.com/office/drawing/2015/10/21/chartex" xmlns:cx3="http://schemas.microsoft.com/office/drawing/2016/5/9/chartex" xmlns:cx4="http://schemas.microsoft.com/office/drawing/2016/5/10/chartex" xmlns:cx5="http://schemas.microsoft.com/office/drawing/2016/5/11/chartex" xmlns:cx6="http://schemas.microsoft.com/office/drawing/2016/5/12/chartex" xmlns:cx7="http://schemas.microsoft.com/office/drawing/2016/5/13/chartex" xmlns:cx8="http://schemas.microsoft.com/office/drawing/2016/5/14/chartex" xmlns:mc="http://schemas.openxmlformats.org/markup-compatibility/2006" xmlns:m="http://schemas.openxmlformats.org/officeDocument/2006/math" xmlns:aink="http://schemas.microsoft.com/office/drawing/2016/ink" xmlns:am3d="http://schemas.microsoft.com/office/drawing/2017/model3d" xmlns:oel="http://schemas.microsoft.com/office/2019/extlst" xmlns:r="http://schemas.openxmlformats.org/officeDocument/2006/relationships" xmlns:wp14="http://schemas.microsoft.com/office/word/2010/wordprocessingDrawing" xmlns:wp="http://schemas.openxmlformats.org/drawingml/2006/wordprocessingDrawing" xmlns:wpg="http://schemas.microsoft.com/office/word/2010/wordprocessingGroup" xmlns:wpi="http://schemas.microsoft.com/office/word/2010/wordprocessingInk" xmlns:wps="http://schemas.microsoft.com/office/word/2010/wordprocessingShape" xmlns:o="urn:schemas-microsoft-com:office:office" xmlns:v="urn:schemas-microsoft-com:vml" xmlns:w10="urn:schemas-microsoft-com:office:word" xmlns:w="http://schemas.openxmlformats.org/wordprocessingml/2006/main" xmlns:w14="http://schemas.microsoft.com/office/word/2010/wordml" xmlns:w15="http://schemas.microsoft.com/office/word/2012/wordml" xmlns:w16cex="http://schemas.microsoft.com/office/word/2018/wordml/cex" xmlns:w16cid="http://schemas.microsoft.com/office/word/2016/wordml/cid" xmlns:w16="http://schemas.microsoft.com/office/word/2018/wordml" xmlns:w16sdtdh="http://schemas.microsoft.com/office/word/2020/wordml/sdtdatahash" xmlns:w16sdtfl="http://schemas.microsoft.com/office/word/2024/wordml/sdtformatlock" xmlns:w16se="http://schemas.microsoft.com/office/word/2015/wordml/symex" xmlns:w16du="http://schemas.microsoft.com/office/word/2023/wordml/word16du" xmlns:wne="http://schemas.microsoft.com/office/word/2006/wordml" mc:Ignorable="w14 w15 w16se w16cid w16 w16cex w16sdtdh w16sdtfl w16du wp14">
   <w:body>
-    <w:p>
-      <w:pPr>
-        <w:rPr>
-          <w:rFonts w:hint="eastAsia"/>
-        </w:rPr>
-      </w:pPr>
-    </w:p>
+    <w:p/>
     <w:tbl>
       <w:tblPr>
         <w:tblStyle w:val="af"/>
@@ -129,6 +123,15 @@
       <w:r>
         <w:t>检测结果：请参见下页</w:t>
       </w:r>
+    </w:p>
+    <w:p/>
+    <w:p/>
+    <w:p>
+      <w:pPr>
+        <w:rPr>
+          <w:rFonts w:hint="eastAsia"/>
+        </w:rPr>
+      </w:pPr>
     </w:p>
     <w:tbl>
       <w:tblPr>
@@ -531,7 +534,7 @@
         <w:t>上海华测品正检测技术有限公司</w:t>
       </w:r>
       <w:r>
-        <w:t xml:space="preserve">                                     </w:t>
+        <w:t xml:space="preserve">                             </w:t>
       </w:r>
       <w:r>
         <w:t>上海市闵行区万芳路</w:t>
@@ -691,38 +694,18 @@
     <w:p/>
     <w:p>
       <w:r>
-        <w:rPr>
-          <w:sz w:val="18"/>
-          <w:szCs w:val="18"/>
-        </w:rPr>
         <w:t>备注：此报告所有</w:t>
       </w:r>
       <w:r>
-        <w:rPr>
-          <w:sz w:val="18"/>
-          <w:szCs w:val="18"/>
-        </w:rPr>
         <w:t>/</w:t>
       </w:r>
       <w:r>
-        <w:rPr>
-          <w:sz w:val="18"/>
-          <w:szCs w:val="18"/>
-        </w:rPr>
         <w:t>部分项目不在</w:t>
       </w:r>
       <w:r>
-        <w:rPr>
-          <w:sz w:val="18"/>
-          <w:szCs w:val="18"/>
-        </w:rPr>
         <w:t>CMA</w:t>
       </w:r>
       <w:r>
-        <w:rPr>
-          <w:sz w:val="18"/>
-          <w:szCs w:val="18"/>
-        </w:rPr>
         <w:t>资质认定范围内，出具的数据结果供科研、教学、企业内部质量控制、企业产品研发等目的用。</w:t>
       </w:r>
     </w:p>
@@ -845,7 +828,7 @@
         <w:sz w:val="21"/>
         <w:szCs w:val="21"/>
       </w:rPr>
-      <w:pict w14:anchorId="4DB2CD19">
+      <w:pict w14:anchorId="2B72B964">
         <v:shapetype id="_x0000_t75" coordsize="21600,21600" o:spt="75" o:preferrelative="t" path="m@4@5l@4@11@9@11@9@5xe" filled="f" stroked="f">
           <v:stroke joinstyle="miter"/>
           <v:formulas>
@@ -1046,7 +1029,7 @@
       <w:rPr>
         <w:b/>
       </w:rPr>
-      <w:pict w14:anchorId="0409465A">
+      <w:pict w14:anchorId="69551075">
         <v:shapetype id="_x0000_t75" coordsize="21600,21600" o:spt="75" o:preferrelative="t" path="m@4@5l@4@11@9@11@9@5xe" filled="f" stroked="f">
           <v:stroke joinstyle="miter"/>
           <v:formulas>
@@ -1066,7 +1049,7 @@
           <v:path o:extrusionok="f" gradientshapeok="t" o:connecttype="rect"/>
           <o:lock v:ext="edit" aspectratio="t"/>
         </v:shapetype>
-        <v:shape id="WordPictureWatermark769220720" o:spid="_x0000_s1026" type="#_x0000_t75" alt="" style="position:absolute;left:0;text-align:left;margin-left:-78.7pt;margin-top:-202.4pt;width:596.35pt;height:843.1pt;z-index:-251655168;mso-wrap-edited:f;mso-width-percent:0;mso-height-percent:0;mso-position-horizontal-relative:margin;mso-position-vertical-relative:margin;mso-width-percent:0;mso-height-percent:0;mso-width-relative:page;mso-height-relative:page" o:allowincell="f">
+        <v:shape id="WordPictureWatermark769220720" o:spid="_x0000_s1026" type="#_x0000_t75" alt="" style="position:absolute;left:0;text-align:left;margin-left:-78.7pt;margin-top:-173.9pt;width:596.35pt;height:843.1pt;z-index:-251655168;mso-wrap-edited:f;mso-width-percent:0;mso-height-percent:0;mso-position-horizontal-relative:margin;mso-position-vertical-relative:margin;mso-width-percent:0;mso-height-percent:0;mso-width-relative:page;mso-height-relative:page" o:allowincell="f">
           <v:imagedata r:id="rId1" o:title="CTI背景~~"/>
           <w10:wrap anchorx="margin" anchory="margin"/>
         </v:shape>
@@ -1087,7 +1070,7 @@
         <w:sz w:val="21"/>
         <w:szCs w:val="21"/>
       </w:rPr>
-      <w:pict w14:anchorId="11582D4B">
+      <w:pict w14:anchorId="4800A0E0">
         <v:shapetype id="_x0000_t75" coordsize="21600,21600" o:spt="75" o:preferrelative="t" path="m@4@5l@4@11@9@11@9@5xe" filled="f" stroked="f">
           <v:stroke joinstyle="miter"/>
           <v:formulas>

</xml_diff>